<commit_message>
docs: update software development plan and use case specifications
</commit_message>
<xml_diff>
--- a/pa/PA1/01. Software Development Plan.docx
+++ b/pa/PA1/01. Software Development Plan.docx
@@ -392,10 +392,13 @@
           <w:tab w:val="right" w:pos="9350"/>
         </w:tabs>
         <w:rPr>
+          <w:rFonts w:asciiTheme="minorHAnsi" w:eastAsiaTheme="minorEastAsia" w:hAnsiTheme="minorHAnsi" w:cstheme="minorBidi"/>
           <w:b w:val="0"/>
           <w:bCs w:val="0"/>
           <w:noProof/>
+          <w:kern w:val="2"/>
           <w:sz w:val="24"/>
+          <w14:ligatures w14:val="standardContextual"/>
         </w:rPr>
       </w:pPr>
       <w:r>
@@ -419,7 +422,7 @@
         </w:rPr>
         <w:fldChar w:fldCharType="separate"/>
       </w:r>
-      <w:hyperlink w:anchor="_Toc307271011" w:history="1">
+      <w:hyperlink w:anchor="_Toc243574422" w:history="1">
         <w:r>
           <w:rPr>
             <w:rStyle w:val="Hyperlink"/>
@@ -429,10 +432,13 @@
         </w:r>
         <w:r>
           <w:rPr>
+            <w:rFonts w:asciiTheme="minorHAnsi" w:eastAsiaTheme="minorEastAsia" w:hAnsiTheme="minorHAnsi" w:cstheme="minorBidi"/>
             <w:b w:val="0"/>
             <w:bCs w:val="0"/>
             <w:noProof/>
+            <w:kern w:val="2"/>
             <w:sz w:val="24"/>
+            <w14:ligatures w14:val="standardContextual"/>
           </w:rPr>
           <w:tab/>
         </w:r>
@@ -462,7 +468,7 @@
             <w:noProof/>
             <w:webHidden/>
           </w:rPr>
-          <w:instrText xml:space="preserve"> PAGEREF _Toc307271011 \h </w:instrText>
+          <w:instrText xml:space="preserve"> PAGEREF _Toc243574422 \h </w:instrText>
         </w:r>
         <w:r>
           <w:rPr>
@@ -501,13 +507,16 @@
           <w:tab w:val="right" w:pos="9350"/>
         </w:tabs>
         <w:rPr>
+          <w:rFonts w:asciiTheme="minorHAnsi" w:eastAsiaTheme="minorEastAsia" w:hAnsiTheme="minorHAnsi" w:cstheme="minorBidi"/>
           <w:i w:val="0"/>
           <w:iCs w:val="0"/>
           <w:noProof/>
+          <w:kern w:val="2"/>
           <w:sz w:val="24"/>
-        </w:rPr>
-      </w:pPr>
-      <w:hyperlink w:anchor="_Toc307271012" w:history="1">
+          <w14:ligatures w14:val="standardContextual"/>
+        </w:rPr>
+      </w:pPr>
+      <w:hyperlink w:anchor="_Toc243574423" w:history="1">
         <w:r>
           <w:rPr>
             <w:rStyle w:val="Hyperlink"/>
@@ -517,10 +526,13 @@
         </w:r>
         <w:r>
           <w:rPr>
+            <w:rFonts w:asciiTheme="minorHAnsi" w:eastAsiaTheme="minorEastAsia" w:hAnsiTheme="minorHAnsi" w:cstheme="minorBidi"/>
             <w:i w:val="0"/>
             <w:iCs w:val="0"/>
             <w:noProof/>
+            <w:kern w:val="2"/>
             <w:sz w:val="24"/>
+            <w14:ligatures w14:val="standardContextual"/>
           </w:rPr>
           <w:tab/>
         </w:r>
@@ -550,7 +562,7 @@
             <w:noProof/>
             <w:webHidden/>
           </w:rPr>
-          <w:instrText xml:space="preserve"> PAGEREF _Toc307271012 \h </w:instrText>
+          <w:instrText xml:space="preserve"> PAGEREF _Toc243574423 \h </w:instrText>
         </w:r>
         <w:r>
           <w:rPr>
@@ -589,13 +601,16 @@
           <w:tab w:val="right" w:pos="9350"/>
         </w:tabs>
         <w:rPr>
+          <w:rFonts w:asciiTheme="minorHAnsi" w:eastAsiaTheme="minorEastAsia" w:hAnsiTheme="minorHAnsi" w:cstheme="minorBidi"/>
           <w:i w:val="0"/>
           <w:iCs w:val="0"/>
           <w:noProof/>
+          <w:kern w:val="2"/>
           <w:sz w:val="24"/>
-        </w:rPr>
-      </w:pPr>
-      <w:hyperlink w:anchor="_Toc307271013" w:history="1">
+          <w14:ligatures w14:val="standardContextual"/>
+        </w:rPr>
+      </w:pPr>
+      <w:hyperlink w:anchor="_Toc243574424" w:history="1">
         <w:r>
           <w:rPr>
             <w:rStyle w:val="Hyperlink"/>
@@ -605,10 +620,13 @@
         </w:r>
         <w:r>
           <w:rPr>
+            <w:rFonts w:asciiTheme="minorHAnsi" w:eastAsiaTheme="minorEastAsia" w:hAnsiTheme="minorHAnsi" w:cstheme="minorBidi"/>
             <w:i w:val="0"/>
             <w:iCs w:val="0"/>
             <w:noProof/>
+            <w:kern w:val="2"/>
             <w:sz w:val="24"/>
+            <w14:ligatures w14:val="standardContextual"/>
           </w:rPr>
           <w:tab/>
         </w:r>
@@ -638,7 +656,7 @@
             <w:noProof/>
             <w:webHidden/>
           </w:rPr>
-          <w:instrText xml:space="preserve"> PAGEREF _Toc307271013 \h </w:instrText>
+          <w:instrText xml:space="preserve"> PAGEREF _Toc243574424 \h </w:instrText>
         </w:r>
         <w:r>
           <w:rPr>
@@ -677,13 +695,16 @@
           <w:tab w:val="right" w:pos="9350"/>
         </w:tabs>
         <w:rPr>
+          <w:rFonts w:asciiTheme="minorHAnsi" w:eastAsiaTheme="minorEastAsia" w:hAnsiTheme="minorHAnsi" w:cstheme="minorBidi"/>
           <w:i w:val="0"/>
           <w:iCs w:val="0"/>
           <w:noProof/>
+          <w:kern w:val="2"/>
           <w:sz w:val="24"/>
-        </w:rPr>
-      </w:pPr>
-      <w:hyperlink w:anchor="_Toc307271014" w:history="1">
+          <w14:ligatures w14:val="standardContextual"/>
+        </w:rPr>
+      </w:pPr>
+      <w:hyperlink w:anchor="_Toc243574425" w:history="1">
         <w:r>
           <w:rPr>
             <w:rStyle w:val="Hyperlink"/>
@@ -693,10 +714,13 @@
         </w:r>
         <w:r>
           <w:rPr>
+            <w:rFonts w:asciiTheme="minorHAnsi" w:eastAsiaTheme="minorEastAsia" w:hAnsiTheme="minorHAnsi" w:cstheme="minorBidi"/>
             <w:i w:val="0"/>
             <w:iCs w:val="0"/>
             <w:noProof/>
+            <w:kern w:val="2"/>
             <w:sz w:val="24"/>
+            <w14:ligatures w14:val="standardContextual"/>
           </w:rPr>
           <w:tab/>
         </w:r>
@@ -726,7 +750,7 @@
             <w:noProof/>
             <w:webHidden/>
           </w:rPr>
-          <w:instrText xml:space="preserve"> PAGEREF _Toc307271014 \h </w:instrText>
+          <w:instrText xml:space="preserve"> PAGEREF _Toc243574425 \h </w:instrText>
         </w:r>
         <w:r>
           <w:rPr>
@@ -746,7 +770,7 @@
             <w:noProof/>
             <w:webHidden/>
           </w:rPr>
-          <w:t>4</w:t>
+          <w:t>5</w:t>
         </w:r>
         <w:r>
           <w:rPr>
@@ -765,13 +789,16 @@
           <w:tab w:val="right" w:pos="9350"/>
         </w:tabs>
         <w:rPr>
+          <w:rFonts w:asciiTheme="minorHAnsi" w:eastAsiaTheme="minorEastAsia" w:hAnsiTheme="minorHAnsi" w:cstheme="minorBidi"/>
           <w:b w:val="0"/>
           <w:bCs w:val="0"/>
           <w:noProof/>
+          <w:kern w:val="2"/>
           <w:sz w:val="24"/>
-        </w:rPr>
-      </w:pPr>
-      <w:hyperlink w:anchor="_Toc307271015" w:history="1">
+          <w14:ligatures w14:val="standardContextual"/>
+        </w:rPr>
+      </w:pPr>
+      <w:hyperlink w:anchor="_Toc243574426" w:history="1">
         <w:r>
           <w:rPr>
             <w:rStyle w:val="Hyperlink"/>
@@ -781,10 +808,13 @@
         </w:r>
         <w:r>
           <w:rPr>
+            <w:rFonts w:asciiTheme="minorHAnsi" w:eastAsiaTheme="minorEastAsia" w:hAnsiTheme="minorHAnsi" w:cstheme="minorBidi"/>
             <w:b w:val="0"/>
             <w:bCs w:val="0"/>
             <w:noProof/>
+            <w:kern w:val="2"/>
             <w:sz w:val="24"/>
+            <w14:ligatures w14:val="standardContextual"/>
           </w:rPr>
           <w:tab/>
         </w:r>
@@ -814,7 +844,7 @@
             <w:noProof/>
             <w:webHidden/>
           </w:rPr>
-          <w:instrText xml:space="preserve"> PAGEREF _Toc307271015 \h </w:instrText>
+          <w:instrText xml:space="preserve"> PAGEREF _Toc243574426 \h </w:instrText>
         </w:r>
         <w:r>
           <w:rPr>
@@ -834,7 +864,7 @@
             <w:noProof/>
             <w:webHidden/>
           </w:rPr>
-          <w:t>4</w:t>
+          <w:t>5</w:t>
         </w:r>
         <w:r>
           <w:rPr>
@@ -853,13 +883,16 @@
           <w:tab w:val="right" w:pos="9350"/>
         </w:tabs>
         <w:rPr>
+          <w:rFonts w:asciiTheme="minorHAnsi" w:eastAsiaTheme="minorEastAsia" w:hAnsiTheme="minorHAnsi" w:cstheme="minorBidi"/>
           <w:i w:val="0"/>
           <w:iCs w:val="0"/>
           <w:noProof/>
+          <w:kern w:val="2"/>
           <w:sz w:val="24"/>
-        </w:rPr>
-      </w:pPr>
-      <w:hyperlink w:anchor="_Toc307271016" w:history="1">
+          <w14:ligatures w14:val="standardContextual"/>
+        </w:rPr>
+      </w:pPr>
+      <w:hyperlink w:anchor="_Toc243574427" w:history="1">
         <w:r>
           <w:rPr>
             <w:rStyle w:val="Hyperlink"/>
@@ -869,10 +902,13 @@
         </w:r>
         <w:r>
           <w:rPr>
+            <w:rFonts w:asciiTheme="minorHAnsi" w:eastAsiaTheme="minorEastAsia" w:hAnsiTheme="minorHAnsi" w:cstheme="minorBidi"/>
             <w:i w:val="0"/>
             <w:iCs w:val="0"/>
             <w:noProof/>
+            <w:kern w:val="2"/>
             <w:sz w:val="24"/>
+            <w14:ligatures w14:val="standardContextual"/>
           </w:rPr>
           <w:tab/>
         </w:r>
@@ -902,7 +938,7 @@
             <w:noProof/>
             <w:webHidden/>
           </w:rPr>
-          <w:instrText xml:space="preserve"> PAGEREF _Toc307271016 \h </w:instrText>
+          <w:instrText xml:space="preserve"> PAGEREF _Toc243574427 \h </w:instrText>
         </w:r>
         <w:r>
           <w:rPr>
@@ -922,7 +958,7 @@
             <w:noProof/>
             <w:webHidden/>
           </w:rPr>
-          <w:t>4</w:t>
+          <w:t>5</w:t>
         </w:r>
         <w:r>
           <w:rPr>
@@ -941,13 +977,16 @@
           <w:tab w:val="right" w:pos="9350"/>
         </w:tabs>
         <w:rPr>
+          <w:rFonts w:asciiTheme="minorHAnsi" w:eastAsiaTheme="minorEastAsia" w:hAnsiTheme="minorHAnsi" w:cstheme="minorBidi"/>
           <w:i w:val="0"/>
           <w:iCs w:val="0"/>
           <w:noProof/>
+          <w:kern w:val="2"/>
           <w:sz w:val="24"/>
-        </w:rPr>
-      </w:pPr>
-      <w:hyperlink w:anchor="_Toc307271017" w:history="1">
+          <w14:ligatures w14:val="standardContextual"/>
+        </w:rPr>
+      </w:pPr>
+      <w:hyperlink w:anchor="_Toc243574428" w:history="1">
         <w:r>
           <w:rPr>
             <w:rStyle w:val="Hyperlink"/>
@@ -957,10 +996,13 @@
         </w:r>
         <w:r>
           <w:rPr>
+            <w:rFonts w:asciiTheme="minorHAnsi" w:eastAsiaTheme="minorEastAsia" w:hAnsiTheme="minorHAnsi" w:cstheme="minorBidi"/>
             <w:i w:val="0"/>
             <w:iCs w:val="0"/>
             <w:noProof/>
+            <w:kern w:val="2"/>
             <w:sz w:val="24"/>
+            <w14:ligatures w14:val="standardContextual"/>
           </w:rPr>
           <w:tab/>
         </w:r>
@@ -990,7 +1032,7 @@
             <w:noProof/>
             <w:webHidden/>
           </w:rPr>
-          <w:instrText xml:space="preserve"> PAGEREF _Toc307271017 \h </w:instrText>
+          <w:instrText xml:space="preserve"> PAGEREF _Toc243574428 \h </w:instrText>
         </w:r>
         <w:r>
           <w:rPr>
@@ -1010,7 +1052,7 @@
             <w:noProof/>
             <w:webHidden/>
           </w:rPr>
-          <w:t>4</w:t>
+          <w:t>6</w:t>
         </w:r>
         <w:r>
           <w:rPr>
@@ -1029,13 +1071,16 @@
           <w:tab w:val="right" w:pos="9350"/>
         </w:tabs>
         <w:rPr>
+          <w:rFonts w:asciiTheme="minorHAnsi" w:eastAsiaTheme="minorEastAsia" w:hAnsiTheme="minorHAnsi" w:cstheme="minorBidi"/>
           <w:i w:val="0"/>
           <w:iCs w:val="0"/>
           <w:noProof/>
+          <w:kern w:val="2"/>
           <w:sz w:val="24"/>
-        </w:rPr>
-      </w:pPr>
-      <w:hyperlink w:anchor="_Toc307271018" w:history="1">
+          <w14:ligatures w14:val="standardContextual"/>
+        </w:rPr>
+      </w:pPr>
+      <w:hyperlink w:anchor="_Toc243574429" w:history="1">
         <w:r>
           <w:rPr>
             <w:rStyle w:val="Hyperlink"/>
@@ -1045,10 +1090,13 @@
         </w:r>
         <w:r>
           <w:rPr>
+            <w:rFonts w:asciiTheme="minorHAnsi" w:eastAsiaTheme="minorEastAsia" w:hAnsiTheme="minorHAnsi" w:cstheme="minorBidi"/>
             <w:i w:val="0"/>
             <w:iCs w:val="0"/>
             <w:noProof/>
+            <w:kern w:val="2"/>
             <w:sz w:val="24"/>
+            <w14:ligatures w14:val="standardContextual"/>
           </w:rPr>
           <w:tab/>
         </w:r>
@@ -1078,7 +1126,7 @@
             <w:noProof/>
             <w:webHidden/>
           </w:rPr>
-          <w:instrText xml:space="preserve"> PAGEREF _Toc307271018 \h </w:instrText>
+          <w:instrText xml:space="preserve"> PAGEREF _Toc243574429 \h </w:instrText>
         </w:r>
         <w:r>
           <w:rPr>
@@ -1098,7 +1146,7 @@
             <w:noProof/>
             <w:webHidden/>
           </w:rPr>
-          <w:t>5</w:t>
+          <w:t>6</w:t>
         </w:r>
         <w:r>
           <w:rPr>
@@ -1117,13 +1165,16 @@
           <w:tab w:val="right" w:pos="9350"/>
         </w:tabs>
         <w:rPr>
+          <w:rFonts w:asciiTheme="minorHAnsi" w:eastAsiaTheme="minorEastAsia" w:hAnsiTheme="minorHAnsi" w:cstheme="minorBidi"/>
           <w:b w:val="0"/>
           <w:bCs w:val="0"/>
           <w:noProof/>
+          <w:kern w:val="2"/>
           <w:sz w:val="24"/>
-        </w:rPr>
-      </w:pPr>
-      <w:hyperlink w:anchor="_Toc307271019" w:history="1">
+          <w14:ligatures w14:val="standardContextual"/>
+        </w:rPr>
+      </w:pPr>
+      <w:hyperlink w:anchor="_Toc243574430" w:history="1">
         <w:r>
           <w:rPr>
             <w:rStyle w:val="Hyperlink"/>
@@ -1133,10 +1184,13 @@
         </w:r>
         <w:r>
           <w:rPr>
+            <w:rFonts w:asciiTheme="minorHAnsi" w:eastAsiaTheme="minorEastAsia" w:hAnsiTheme="minorHAnsi" w:cstheme="minorBidi"/>
             <w:b w:val="0"/>
             <w:bCs w:val="0"/>
             <w:noProof/>
+            <w:kern w:val="2"/>
             <w:sz w:val="24"/>
+            <w14:ligatures w14:val="standardContextual"/>
           </w:rPr>
           <w:tab/>
         </w:r>
@@ -1166,7 +1220,7 @@
             <w:noProof/>
             <w:webHidden/>
           </w:rPr>
-          <w:instrText xml:space="preserve"> PAGEREF _Toc307271019 \h </w:instrText>
+          <w:instrText xml:space="preserve"> PAGEREF _Toc243574430 \h </w:instrText>
         </w:r>
         <w:r>
           <w:rPr>
@@ -1186,7 +1240,7 @@
             <w:noProof/>
             <w:webHidden/>
           </w:rPr>
-          <w:t>5</w:t>
+          <w:t>7</w:t>
         </w:r>
         <w:r>
           <w:rPr>
@@ -1205,13 +1259,16 @@
           <w:tab w:val="right" w:pos="9350"/>
         </w:tabs>
         <w:rPr>
+          <w:rFonts w:asciiTheme="minorHAnsi" w:eastAsiaTheme="minorEastAsia" w:hAnsiTheme="minorHAnsi" w:cstheme="minorBidi"/>
           <w:i w:val="0"/>
           <w:iCs w:val="0"/>
           <w:noProof/>
+          <w:kern w:val="2"/>
           <w:sz w:val="24"/>
-        </w:rPr>
-      </w:pPr>
-      <w:hyperlink w:anchor="_Toc307271020" w:history="1">
+          <w14:ligatures w14:val="standardContextual"/>
+        </w:rPr>
+      </w:pPr>
+      <w:hyperlink w:anchor="_Toc243574431" w:history="1">
         <w:r>
           <w:rPr>
             <w:rStyle w:val="Hyperlink"/>
@@ -1221,10 +1278,13 @@
         </w:r>
         <w:r>
           <w:rPr>
+            <w:rFonts w:asciiTheme="minorHAnsi" w:eastAsiaTheme="minorEastAsia" w:hAnsiTheme="minorHAnsi" w:cstheme="minorBidi"/>
             <w:i w:val="0"/>
             <w:iCs w:val="0"/>
             <w:noProof/>
+            <w:kern w:val="2"/>
             <w:sz w:val="24"/>
+            <w14:ligatures w14:val="standardContextual"/>
           </w:rPr>
           <w:tab/>
         </w:r>
@@ -1254,7 +1314,7 @@
             <w:noProof/>
             <w:webHidden/>
           </w:rPr>
-          <w:instrText xml:space="preserve"> PAGEREF _Toc307271020 \h </w:instrText>
+          <w:instrText xml:space="preserve"> PAGEREF _Toc243574431 \h </w:instrText>
         </w:r>
         <w:r>
           <w:rPr>
@@ -1274,7 +1334,7 @@
             <w:noProof/>
             <w:webHidden/>
           </w:rPr>
-          <w:t>5</w:t>
+          <w:t>7</w:t>
         </w:r>
         <w:r>
           <w:rPr>
@@ -1293,13 +1353,16 @@
           <w:tab w:val="right" w:pos="9350"/>
         </w:tabs>
         <w:rPr>
+          <w:rFonts w:asciiTheme="minorHAnsi" w:eastAsiaTheme="minorEastAsia" w:hAnsiTheme="minorHAnsi" w:cstheme="minorBidi"/>
           <w:i w:val="0"/>
           <w:iCs w:val="0"/>
           <w:noProof/>
+          <w:kern w:val="2"/>
           <w:sz w:val="24"/>
-        </w:rPr>
-      </w:pPr>
-      <w:hyperlink w:anchor="_Toc307271021" w:history="1">
+          <w14:ligatures w14:val="standardContextual"/>
+        </w:rPr>
+      </w:pPr>
+      <w:hyperlink w:anchor="_Toc243574432" w:history="1">
         <w:r>
           <w:rPr>
             <w:rStyle w:val="Hyperlink"/>
@@ -1309,10 +1372,13 @@
         </w:r>
         <w:r>
           <w:rPr>
+            <w:rFonts w:asciiTheme="minorHAnsi" w:eastAsiaTheme="minorEastAsia" w:hAnsiTheme="minorHAnsi" w:cstheme="minorBidi"/>
             <w:i w:val="0"/>
             <w:iCs w:val="0"/>
             <w:noProof/>
+            <w:kern w:val="2"/>
             <w:sz w:val="24"/>
+            <w14:ligatures w14:val="standardContextual"/>
           </w:rPr>
           <w:tab/>
         </w:r>
@@ -1342,7 +1408,7 @@
             <w:noProof/>
             <w:webHidden/>
           </w:rPr>
-          <w:instrText xml:space="preserve"> PAGEREF _Toc307271021 \h </w:instrText>
+          <w:instrText xml:space="preserve"> PAGEREF _Toc243574432 \h </w:instrText>
         </w:r>
         <w:r>
           <w:rPr>
@@ -1362,7 +1428,7 @@
             <w:noProof/>
             <w:webHidden/>
           </w:rPr>
-          <w:t>5</w:t>
+          <w:t>8</w:t>
         </w:r>
         <w:r>
           <w:rPr>
@@ -1381,13 +1447,16 @@
           <w:tab w:val="right" w:pos="9350"/>
         </w:tabs>
         <w:rPr>
+          <w:rFonts w:asciiTheme="minorHAnsi" w:eastAsiaTheme="minorEastAsia" w:hAnsiTheme="minorHAnsi" w:cstheme="minorBidi"/>
           <w:b w:val="0"/>
           <w:bCs w:val="0"/>
           <w:noProof/>
+          <w:kern w:val="2"/>
           <w:sz w:val="24"/>
-        </w:rPr>
-      </w:pPr>
-      <w:hyperlink w:anchor="_Toc307271022" w:history="1">
+          <w14:ligatures w14:val="standardContextual"/>
+        </w:rPr>
+      </w:pPr>
+      <w:hyperlink w:anchor="_Toc243574433" w:history="1">
         <w:r>
           <w:rPr>
             <w:rStyle w:val="Hyperlink"/>
@@ -1397,10 +1466,13 @@
         </w:r>
         <w:r>
           <w:rPr>
+            <w:rFonts w:asciiTheme="minorHAnsi" w:eastAsiaTheme="minorEastAsia" w:hAnsiTheme="minorHAnsi" w:cstheme="minorBidi"/>
             <w:b w:val="0"/>
             <w:bCs w:val="0"/>
             <w:noProof/>
+            <w:kern w:val="2"/>
             <w:sz w:val="24"/>
+            <w14:ligatures w14:val="standardContextual"/>
           </w:rPr>
           <w:tab/>
         </w:r>
@@ -1430,7 +1502,7 @@
             <w:noProof/>
             <w:webHidden/>
           </w:rPr>
-          <w:instrText xml:space="preserve"> PAGEREF _Toc307271022 \h </w:instrText>
+          <w:instrText xml:space="preserve"> PAGEREF _Toc243574433 \h </w:instrText>
         </w:r>
         <w:r>
           <w:rPr>
@@ -1450,7 +1522,7 @@
             <w:noProof/>
             <w:webHidden/>
           </w:rPr>
-          <w:t>5</w:t>
+          <w:t>9</w:t>
         </w:r>
         <w:r>
           <w:rPr>
@@ -1469,13 +1541,16 @@
           <w:tab w:val="right" w:pos="9350"/>
         </w:tabs>
         <w:rPr>
+          <w:rFonts w:asciiTheme="minorHAnsi" w:eastAsiaTheme="minorEastAsia" w:hAnsiTheme="minorHAnsi" w:cstheme="minorBidi"/>
           <w:i w:val="0"/>
           <w:iCs w:val="0"/>
           <w:noProof/>
+          <w:kern w:val="2"/>
           <w:sz w:val="24"/>
-        </w:rPr>
-      </w:pPr>
-      <w:hyperlink w:anchor="_Toc307271023" w:history="1">
+          <w14:ligatures w14:val="standardContextual"/>
+        </w:rPr>
+      </w:pPr>
+      <w:hyperlink w:anchor="_Toc243574434" w:history="1">
         <w:r>
           <w:rPr>
             <w:rStyle w:val="Hyperlink"/>
@@ -1485,10 +1560,13 @@
         </w:r>
         <w:r>
           <w:rPr>
+            <w:rFonts w:asciiTheme="minorHAnsi" w:eastAsiaTheme="minorEastAsia" w:hAnsiTheme="minorHAnsi" w:cstheme="minorBidi"/>
             <w:i w:val="0"/>
             <w:iCs w:val="0"/>
             <w:noProof/>
+            <w:kern w:val="2"/>
             <w:sz w:val="24"/>
+            <w14:ligatures w14:val="standardContextual"/>
           </w:rPr>
           <w:tab/>
         </w:r>
@@ -1518,7 +1596,7 @@
             <w:noProof/>
             <w:webHidden/>
           </w:rPr>
-          <w:instrText xml:space="preserve"> PAGEREF _Toc307271023 \h </w:instrText>
+          <w:instrText xml:space="preserve"> PAGEREF _Toc243574434 \h </w:instrText>
         </w:r>
         <w:r>
           <w:rPr>
@@ -1538,7 +1616,367 @@
             <w:noProof/>
             <w:webHidden/>
           </w:rPr>
-          <w:t>5</w:t>
+          <w:t>9</w:t>
+        </w:r>
+        <w:r>
+          <w:rPr>
+            <w:noProof/>
+            <w:webHidden/>
+          </w:rPr>
+          <w:fldChar w:fldCharType="end"/>
+        </w:r>
+      </w:hyperlink>
+    </w:p>
+    <w:p>
+      <w:pPr>
+        <w:pStyle w:val="TOC3"/>
+        <w:tabs>
+          <w:tab w:val="left" w:pos="1200"/>
+          <w:tab w:val="right" w:pos="9350"/>
+        </w:tabs>
+        <w:rPr>
+          <w:rFonts w:asciiTheme="minorHAnsi" w:eastAsiaTheme="minorEastAsia" w:hAnsiTheme="minorHAnsi" w:cstheme="minorBidi"/>
+          <w:noProof/>
+          <w:kern w:val="2"/>
+          <w:sz w:val="24"/>
+          <w14:ligatures w14:val="standardContextual"/>
+        </w:rPr>
+      </w:pPr>
+      <w:hyperlink w:anchor="_Toc243574435" w:history="1">
+        <w:r>
+          <w:rPr>
+            <w:rStyle w:val="Hyperlink"/>
+            <w:noProof/>
+          </w:rPr>
+          <w:t>4.1.1</w:t>
+        </w:r>
+        <w:r>
+          <w:rPr>
+            <w:rFonts w:asciiTheme="minorHAnsi" w:eastAsiaTheme="minorEastAsia" w:hAnsiTheme="minorHAnsi" w:cstheme="minorBidi"/>
+            <w:noProof/>
+            <w:kern w:val="2"/>
+            <w:sz w:val="24"/>
+            <w14:ligatures w14:val="standardContextual"/>
+          </w:rPr>
+          <w:tab/>
+        </w:r>
+        <w:r>
+          <w:rPr>
+            <w:rStyle w:val="Hyperlink"/>
+            <w:noProof/>
+          </w:rPr>
+          <w:t>Cost Estimate</w:t>
+        </w:r>
+        <w:r>
+          <w:rPr>
+            <w:noProof/>
+            <w:webHidden/>
+          </w:rPr>
+          <w:t xml:space="preserve"> </w:t>
+        </w:r>
+        <w:r>
+          <w:rPr>
+            <w:noProof/>
+            <w:webHidden/>
+          </w:rPr>
+          <w:fldChar w:fldCharType="begin"/>
+        </w:r>
+        <w:r>
+          <w:rPr>
+            <w:noProof/>
+            <w:webHidden/>
+          </w:rPr>
+          <w:instrText xml:space="preserve"> PAGEREF _Toc243574435 \h </w:instrText>
+        </w:r>
+        <w:r>
+          <w:rPr>
+            <w:noProof/>
+            <w:webHidden/>
+          </w:rPr>
+        </w:r>
+        <w:r>
+          <w:rPr>
+            <w:noProof/>
+            <w:webHidden/>
+          </w:rPr>
+          <w:fldChar w:fldCharType="separate"/>
+        </w:r>
+        <w:r>
+          <w:rPr>
+            <w:noProof/>
+            <w:webHidden/>
+          </w:rPr>
+          <w:t>9</w:t>
+        </w:r>
+        <w:r>
+          <w:rPr>
+            <w:noProof/>
+            <w:webHidden/>
+          </w:rPr>
+          <w:fldChar w:fldCharType="end"/>
+        </w:r>
+      </w:hyperlink>
+    </w:p>
+    <w:p>
+      <w:pPr>
+        <w:pStyle w:val="TOC3"/>
+        <w:tabs>
+          <w:tab w:val="left" w:pos="1200"/>
+          <w:tab w:val="right" w:pos="9350"/>
+        </w:tabs>
+        <w:rPr>
+          <w:rFonts w:asciiTheme="minorHAnsi" w:eastAsiaTheme="minorEastAsia" w:hAnsiTheme="minorHAnsi" w:cstheme="minorBidi"/>
+          <w:noProof/>
+          <w:kern w:val="2"/>
+          <w:sz w:val="24"/>
+          <w14:ligatures w14:val="standardContextual"/>
+        </w:rPr>
+      </w:pPr>
+      <w:hyperlink w:anchor="_Toc243574436" w:history="1">
+        <w:r>
+          <w:rPr>
+            <w:rStyle w:val="Hyperlink"/>
+            <w:noProof/>
+          </w:rPr>
+          <w:t>4.1.2</w:t>
+        </w:r>
+        <w:r>
+          <w:rPr>
+            <w:rFonts w:asciiTheme="minorHAnsi" w:eastAsiaTheme="minorEastAsia" w:hAnsiTheme="minorHAnsi" w:cstheme="minorBidi"/>
+            <w:noProof/>
+            <w:kern w:val="2"/>
+            <w:sz w:val="24"/>
+            <w14:ligatures w14:val="standardContextual"/>
+          </w:rPr>
+          <w:tab/>
+        </w:r>
+        <w:r>
+          <w:rPr>
+            <w:rStyle w:val="Hyperlink"/>
+            <w:noProof/>
+          </w:rPr>
+          <w:t>Schedule Estimate</w:t>
+        </w:r>
+        <w:r>
+          <w:rPr>
+            <w:noProof/>
+            <w:webHidden/>
+          </w:rPr>
+          <w:t xml:space="preserve"> </w:t>
+        </w:r>
+        <w:r>
+          <w:rPr>
+            <w:noProof/>
+            <w:webHidden/>
+          </w:rPr>
+          <w:fldChar w:fldCharType="begin"/>
+        </w:r>
+        <w:r>
+          <w:rPr>
+            <w:noProof/>
+            <w:webHidden/>
+          </w:rPr>
+          <w:instrText xml:space="preserve"> PAGEREF _Toc243574436 \h </w:instrText>
+        </w:r>
+        <w:r>
+          <w:rPr>
+            <w:noProof/>
+            <w:webHidden/>
+          </w:rPr>
+        </w:r>
+        <w:r>
+          <w:rPr>
+            <w:noProof/>
+            <w:webHidden/>
+          </w:rPr>
+          <w:fldChar w:fldCharType="separate"/>
+        </w:r>
+        <w:r>
+          <w:rPr>
+            <w:noProof/>
+            <w:webHidden/>
+          </w:rPr>
+          <w:t>9</w:t>
+        </w:r>
+        <w:r>
+          <w:rPr>
+            <w:noProof/>
+            <w:webHidden/>
+          </w:rPr>
+          <w:fldChar w:fldCharType="end"/>
+        </w:r>
+      </w:hyperlink>
+    </w:p>
+    <w:p>
+      <w:pPr>
+        <w:pStyle w:val="TOC3"/>
+        <w:tabs>
+          <w:tab w:val="left" w:pos="1200"/>
+          <w:tab w:val="right" w:pos="9350"/>
+        </w:tabs>
+        <w:rPr>
+          <w:rFonts w:asciiTheme="minorHAnsi" w:eastAsiaTheme="minorEastAsia" w:hAnsiTheme="minorHAnsi" w:cstheme="minorBidi"/>
+          <w:noProof/>
+          <w:kern w:val="2"/>
+          <w:sz w:val="24"/>
+          <w14:ligatures w14:val="standardContextual"/>
+        </w:rPr>
+      </w:pPr>
+      <w:hyperlink w:anchor="_Toc243574437" w:history="1">
+        <w:r>
+          <w:rPr>
+            <w:rStyle w:val="Hyperlink"/>
+            <w:noProof/>
+          </w:rPr>
+          <w:t>4.1.3</w:t>
+        </w:r>
+        <w:r>
+          <w:rPr>
+            <w:rFonts w:asciiTheme="minorHAnsi" w:eastAsiaTheme="minorEastAsia" w:hAnsiTheme="minorHAnsi" w:cstheme="minorBidi"/>
+            <w:noProof/>
+            <w:kern w:val="2"/>
+            <w:sz w:val="24"/>
+            <w14:ligatures w14:val="standardContextual"/>
+          </w:rPr>
+          <w:tab/>
+        </w:r>
+        <w:r>
+          <w:rPr>
+            <w:rStyle w:val="Hyperlink"/>
+            <w:noProof/>
+          </w:rPr>
+          <w:t>Basis of Estimates</w:t>
+        </w:r>
+        <w:r>
+          <w:rPr>
+            <w:noProof/>
+            <w:webHidden/>
+          </w:rPr>
+          <w:t xml:space="preserve"> </w:t>
+        </w:r>
+        <w:r>
+          <w:rPr>
+            <w:noProof/>
+            <w:webHidden/>
+          </w:rPr>
+          <w:fldChar w:fldCharType="begin"/>
+        </w:r>
+        <w:r>
+          <w:rPr>
+            <w:noProof/>
+            <w:webHidden/>
+          </w:rPr>
+          <w:instrText xml:space="preserve"> PAGEREF _Toc243574437 \h </w:instrText>
+        </w:r>
+        <w:r>
+          <w:rPr>
+            <w:noProof/>
+            <w:webHidden/>
+          </w:rPr>
+        </w:r>
+        <w:r>
+          <w:rPr>
+            <w:noProof/>
+            <w:webHidden/>
+          </w:rPr>
+          <w:fldChar w:fldCharType="separate"/>
+        </w:r>
+        <w:r>
+          <w:rPr>
+            <w:noProof/>
+            <w:webHidden/>
+          </w:rPr>
+          <w:t>9</w:t>
+        </w:r>
+        <w:r>
+          <w:rPr>
+            <w:noProof/>
+            <w:webHidden/>
+          </w:rPr>
+          <w:fldChar w:fldCharType="end"/>
+        </w:r>
+      </w:hyperlink>
+    </w:p>
+    <w:p>
+      <w:pPr>
+        <w:pStyle w:val="TOC3"/>
+        <w:tabs>
+          <w:tab w:val="left" w:pos="1200"/>
+          <w:tab w:val="right" w:pos="9350"/>
+        </w:tabs>
+        <w:rPr>
+          <w:rFonts w:asciiTheme="minorHAnsi" w:eastAsiaTheme="minorEastAsia" w:hAnsiTheme="minorHAnsi" w:cstheme="minorBidi"/>
+          <w:noProof/>
+          <w:kern w:val="2"/>
+          <w:sz w:val="24"/>
+          <w14:ligatures w14:val="standardContextual"/>
+        </w:rPr>
+      </w:pPr>
+      <w:hyperlink w:anchor="_Toc243574438" w:history="1">
+        <w:r>
+          <w:rPr>
+            <w:rStyle w:val="Hyperlink"/>
+            <w:noProof/>
+          </w:rPr>
+          <w:t>4.1.4</w:t>
+        </w:r>
+        <w:r>
+          <w:rPr>
+            <w:rFonts w:asciiTheme="minorHAnsi" w:eastAsiaTheme="minorEastAsia" w:hAnsiTheme="minorHAnsi" w:cstheme="minorBidi"/>
+            <w:noProof/>
+            <w:kern w:val="2"/>
+            <w:sz w:val="24"/>
+            <w14:ligatures w14:val="standardContextual"/>
+          </w:rPr>
+          <w:tab/>
+        </w:r>
+        <w:r>
+          <w:rPr>
+            <w:rStyle w:val="Hyperlink"/>
+            <w:noProof/>
+          </w:rPr>
+          <w:t>Re-estimation Conditions</w:t>
+        </w:r>
+        <w:r>
+          <w:rPr>
+            <w:noProof/>
+            <w:webHidden/>
+          </w:rPr>
+          <w:t xml:space="preserve"> </w:t>
+        </w:r>
+        <w:r>
+          <w:rPr>
+            <w:noProof/>
+            <w:webHidden/>
+          </w:rPr>
+          <w:fldChar w:fldCharType="begin"/>
+        </w:r>
+        <w:r>
+          <w:rPr>
+            <w:noProof/>
+            <w:webHidden/>
+          </w:rPr>
+          <w:instrText xml:space="preserve"> PAGEREF _Toc243574438 \h </w:instrText>
+        </w:r>
+        <w:r>
+          <w:rPr>
+            <w:noProof/>
+            <w:webHidden/>
+          </w:rPr>
+        </w:r>
+        <w:r>
+          <w:rPr>
+            <w:noProof/>
+            <w:webHidden/>
+          </w:rPr>
+          <w:fldChar w:fldCharType="separate"/>
+        </w:r>
+        <w:r>
+          <w:rPr>
+            <w:noProof/>
+            <w:webHidden/>
+          </w:rPr>
+          <w:t>9</w:t>
         </w:r>
         <w:r>
           <w:rPr>
@@ -1557,13 +1995,16 @@
           <w:tab w:val="right" w:pos="9350"/>
         </w:tabs>
         <w:rPr>
+          <w:rFonts w:asciiTheme="minorHAnsi" w:eastAsiaTheme="minorEastAsia" w:hAnsiTheme="minorHAnsi" w:cstheme="minorBidi"/>
           <w:i w:val="0"/>
           <w:iCs w:val="0"/>
           <w:noProof/>
+          <w:kern w:val="2"/>
           <w:sz w:val="24"/>
-        </w:rPr>
-      </w:pPr>
-      <w:hyperlink w:anchor="_Toc307271024" w:history="1">
+          <w14:ligatures w14:val="standardContextual"/>
+        </w:rPr>
+      </w:pPr>
+      <w:hyperlink w:anchor="_Toc243574439" w:history="1">
         <w:r>
           <w:rPr>
             <w:rStyle w:val="Hyperlink"/>
@@ -1573,10 +2014,13 @@
         </w:r>
         <w:r>
           <w:rPr>
+            <w:rFonts w:asciiTheme="minorHAnsi" w:eastAsiaTheme="minorEastAsia" w:hAnsiTheme="minorHAnsi" w:cstheme="minorBidi"/>
             <w:i w:val="0"/>
             <w:iCs w:val="0"/>
             <w:noProof/>
+            <w:kern w:val="2"/>
             <w:sz w:val="24"/>
+            <w14:ligatures w14:val="standardContextual"/>
           </w:rPr>
           <w:tab/>
         </w:r>
@@ -1606,7 +2050,7 @@
             <w:noProof/>
             <w:webHidden/>
           </w:rPr>
-          <w:instrText xml:space="preserve"> PAGEREF _Toc307271024 \h </w:instrText>
+          <w:instrText xml:space="preserve"> PAGEREF _Toc243574439 \h </w:instrText>
         </w:r>
         <w:r>
           <w:rPr>
@@ -1626,7 +2070,7 @@
             <w:noProof/>
             <w:webHidden/>
           </w:rPr>
-          <w:t>5</w:t>
+          <w:t>10</w:t>
         </w:r>
         <w:r>
           <w:rPr>
@@ -1645,11 +2089,14 @@
           <w:tab w:val="right" w:pos="9350"/>
         </w:tabs>
         <w:rPr>
+          <w:rFonts w:asciiTheme="minorHAnsi" w:eastAsiaTheme="minorEastAsia" w:hAnsiTheme="minorHAnsi" w:cstheme="minorBidi"/>
           <w:noProof/>
+          <w:kern w:val="2"/>
           <w:sz w:val="24"/>
-        </w:rPr>
-      </w:pPr>
-      <w:hyperlink w:anchor="_Toc307271025" w:history="1">
+          <w14:ligatures w14:val="standardContextual"/>
+        </w:rPr>
+      </w:pPr>
+      <w:hyperlink w:anchor="_Toc243574440" w:history="1">
         <w:r>
           <w:rPr>
             <w:rStyle w:val="Hyperlink"/>
@@ -1659,8 +2106,11 @@
         </w:r>
         <w:r>
           <w:rPr>
-            <w:noProof/>
+            <w:rFonts w:asciiTheme="minorHAnsi" w:eastAsiaTheme="minorEastAsia" w:hAnsiTheme="minorHAnsi" w:cstheme="minorBidi"/>
+            <w:noProof/>
+            <w:kern w:val="2"/>
             <w:sz w:val="24"/>
+            <w14:ligatures w14:val="standardContextual"/>
           </w:rPr>
           <w:tab/>
         </w:r>
@@ -1690,7 +2140,7 @@
             <w:noProof/>
             <w:webHidden/>
           </w:rPr>
-          <w:instrText xml:space="preserve"> PAGEREF _Toc307271025 \h </w:instrText>
+          <w:instrText xml:space="preserve"> PAGEREF _Toc243574440 \h </w:instrText>
         </w:r>
         <w:r>
           <w:rPr>
@@ -1710,7 +2160,7 @@
             <w:noProof/>
             <w:webHidden/>
           </w:rPr>
-          <w:t>5</w:t>
+          <w:t>10</w:t>
         </w:r>
         <w:r>
           <w:rPr>
@@ -1729,11 +2179,14 @@
           <w:tab w:val="right" w:pos="9350"/>
         </w:tabs>
         <w:rPr>
+          <w:rFonts w:asciiTheme="minorHAnsi" w:eastAsiaTheme="minorEastAsia" w:hAnsiTheme="minorHAnsi" w:cstheme="minorBidi"/>
           <w:noProof/>
+          <w:kern w:val="2"/>
           <w:sz w:val="24"/>
-        </w:rPr>
-      </w:pPr>
-      <w:hyperlink w:anchor="_Toc307271026" w:history="1">
+          <w14:ligatures w14:val="standardContextual"/>
+        </w:rPr>
+      </w:pPr>
+      <w:hyperlink w:anchor="_Toc243574441" w:history="1">
         <w:r>
           <w:rPr>
             <w:rStyle w:val="Hyperlink"/>
@@ -1743,8 +2196,11 @@
         </w:r>
         <w:r>
           <w:rPr>
-            <w:noProof/>
+            <w:rFonts w:asciiTheme="minorHAnsi" w:eastAsiaTheme="minorEastAsia" w:hAnsiTheme="minorHAnsi" w:cstheme="minorBidi"/>
+            <w:noProof/>
+            <w:kern w:val="2"/>
             <w:sz w:val="24"/>
+            <w14:ligatures w14:val="standardContextual"/>
           </w:rPr>
           <w:tab/>
         </w:r>
@@ -1774,7 +2230,7 @@
             <w:noProof/>
             <w:webHidden/>
           </w:rPr>
-          <w:instrText xml:space="preserve"> PAGEREF _Toc307271026 \h </w:instrText>
+          <w:instrText xml:space="preserve"> PAGEREF _Toc243574441 \h </w:instrText>
         </w:r>
         <w:r>
           <w:rPr>
@@ -1794,7 +2250,7 @@
             <w:noProof/>
             <w:webHidden/>
           </w:rPr>
-          <w:t>6</w:t>
+          <w:t>11</w:t>
         </w:r>
         <w:r>
           <w:rPr>
@@ -1813,11 +2269,14 @@
           <w:tab w:val="right" w:pos="9350"/>
         </w:tabs>
         <w:rPr>
+          <w:rFonts w:asciiTheme="minorHAnsi" w:eastAsiaTheme="minorEastAsia" w:hAnsiTheme="minorHAnsi" w:cstheme="minorBidi"/>
           <w:noProof/>
+          <w:kern w:val="2"/>
           <w:sz w:val="24"/>
-        </w:rPr>
-      </w:pPr>
-      <w:hyperlink w:anchor="_Toc307271027" w:history="1">
+          <w14:ligatures w14:val="standardContextual"/>
+        </w:rPr>
+      </w:pPr>
+      <w:hyperlink w:anchor="_Toc243574442" w:history="1">
         <w:r>
           <w:rPr>
             <w:rStyle w:val="Hyperlink"/>
@@ -1827,8 +2286,11 @@
         </w:r>
         <w:r>
           <w:rPr>
-            <w:noProof/>
+            <w:rFonts w:asciiTheme="minorHAnsi" w:eastAsiaTheme="minorEastAsia" w:hAnsiTheme="minorHAnsi" w:cstheme="minorBidi"/>
+            <w:noProof/>
+            <w:kern w:val="2"/>
             <w:sz w:val="24"/>
+            <w14:ligatures w14:val="standardContextual"/>
           </w:rPr>
           <w:tab/>
         </w:r>
@@ -1858,7 +2320,7 @@
             <w:noProof/>
             <w:webHidden/>
           </w:rPr>
-          <w:instrText xml:space="preserve"> PAGEREF _Toc307271027 \h </w:instrText>
+          <w:instrText xml:space="preserve"> PAGEREF _Toc243574442 \h </w:instrText>
         </w:r>
         <w:r>
           <w:rPr>
@@ -1878,7 +2340,7 @@
             <w:noProof/>
             <w:webHidden/>
           </w:rPr>
-          <w:t>6</w:t>
+          <w:t>12</w:t>
         </w:r>
         <w:r>
           <w:rPr>
@@ -1897,11 +2359,14 @@
           <w:tab w:val="right" w:pos="9350"/>
         </w:tabs>
         <w:rPr>
+          <w:rFonts w:asciiTheme="minorHAnsi" w:eastAsiaTheme="minorEastAsia" w:hAnsiTheme="minorHAnsi" w:cstheme="minorBidi"/>
           <w:noProof/>
+          <w:kern w:val="2"/>
           <w:sz w:val="24"/>
-        </w:rPr>
-      </w:pPr>
-      <w:hyperlink w:anchor="_Toc307271028" w:history="1">
+          <w14:ligatures w14:val="standardContextual"/>
+        </w:rPr>
+      </w:pPr>
+      <w:hyperlink w:anchor="_Toc243574443" w:history="1">
         <w:r>
           <w:rPr>
             <w:rStyle w:val="Hyperlink"/>
@@ -1911,8 +2376,11 @@
         </w:r>
         <w:r>
           <w:rPr>
-            <w:noProof/>
+            <w:rFonts w:asciiTheme="minorHAnsi" w:eastAsiaTheme="minorEastAsia" w:hAnsiTheme="minorHAnsi" w:cstheme="minorBidi"/>
+            <w:noProof/>
+            <w:kern w:val="2"/>
             <w:sz w:val="24"/>
+            <w14:ligatures w14:val="standardContextual"/>
           </w:rPr>
           <w:tab/>
         </w:r>
@@ -1942,7 +2410,7 @@
             <w:noProof/>
             <w:webHidden/>
           </w:rPr>
-          <w:instrText xml:space="preserve"> PAGEREF _Toc307271028 \h </w:instrText>
+          <w:instrText xml:space="preserve"> PAGEREF _Toc243574443 \h </w:instrText>
         </w:r>
         <w:r>
           <w:rPr>
@@ -1962,7 +2430,7 @@
             <w:noProof/>
             <w:webHidden/>
           </w:rPr>
-          <w:t>6</w:t>
+          <w:t>13</w:t>
         </w:r>
         <w:r>
           <w:rPr>
@@ -1981,11 +2449,14 @@
           <w:tab w:val="right" w:pos="9350"/>
         </w:tabs>
         <w:rPr>
+          <w:rFonts w:asciiTheme="minorHAnsi" w:eastAsiaTheme="minorEastAsia" w:hAnsiTheme="minorHAnsi" w:cstheme="minorBidi"/>
           <w:noProof/>
+          <w:kern w:val="2"/>
           <w:sz w:val="24"/>
-        </w:rPr>
-      </w:pPr>
-      <w:hyperlink w:anchor="_Toc307271029" w:history="1">
+          <w14:ligatures w14:val="standardContextual"/>
+        </w:rPr>
+      </w:pPr>
+      <w:hyperlink w:anchor="_Toc243574444" w:history="1">
         <w:r>
           <w:rPr>
             <w:rStyle w:val="Hyperlink"/>
@@ -1995,8 +2466,11 @@
         </w:r>
         <w:r>
           <w:rPr>
-            <w:noProof/>
+            <w:rFonts w:asciiTheme="minorHAnsi" w:eastAsiaTheme="minorEastAsia" w:hAnsiTheme="minorHAnsi" w:cstheme="minorBidi"/>
+            <w:noProof/>
+            <w:kern w:val="2"/>
             <w:sz w:val="24"/>
+            <w14:ligatures w14:val="standardContextual"/>
           </w:rPr>
           <w:tab/>
         </w:r>
@@ -2026,7 +2500,7 @@
             <w:noProof/>
             <w:webHidden/>
           </w:rPr>
-          <w:instrText xml:space="preserve"> PAGEREF _Toc307271029 \h </w:instrText>
+          <w:instrText xml:space="preserve"> PAGEREF _Toc243574444 \h </w:instrText>
         </w:r>
         <w:r>
           <w:rPr>
@@ -2046,7 +2520,7 @@
             <w:noProof/>
             <w:webHidden/>
           </w:rPr>
-          <w:t>6</w:t>
+          <w:t>14</w:t>
         </w:r>
         <w:r>
           <w:rPr>
@@ -2065,13 +2539,16 @@
           <w:tab w:val="right" w:pos="9350"/>
         </w:tabs>
         <w:rPr>
+          <w:rFonts w:asciiTheme="minorHAnsi" w:eastAsiaTheme="minorEastAsia" w:hAnsiTheme="minorHAnsi" w:cstheme="minorBidi"/>
           <w:i w:val="0"/>
           <w:iCs w:val="0"/>
           <w:noProof/>
+          <w:kern w:val="2"/>
           <w:sz w:val="24"/>
-        </w:rPr>
-      </w:pPr>
-      <w:hyperlink w:anchor="_Toc307271030" w:history="1">
+          <w14:ligatures w14:val="standardContextual"/>
+        </w:rPr>
+      </w:pPr>
+      <w:hyperlink w:anchor="_Toc243574445" w:history="1">
         <w:r>
           <w:rPr>
             <w:rStyle w:val="Hyperlink"/>
@@ -2081,10 +2558,13 @@
         </w:r>
         <w:r>
           <w:rPr>
+            <w:rFonts w:asciiTheme="minorHAnsi" w:eastAsiaTheme="minorEastAsia" w:hAnsiTheme="minorHAnsi" w:cstheme="minorBidi"/>
             <w:i w:val="0"/>
             <w:iCs w:val="0"/>
             <w:noProof/>
+            <w:kern w:val="2"/>
             <w:sz w:val="24"/>
+            <w14:ligatures w14:val="standardContextual"/>
           </w:rPr>
           <w:tab/>
         </w:r>
@@ -2114,7 +2594,7 @@
             <w:noProof/>
             <w:webHidden/>
           </w:rPr>
-          <w:instrText xml:space="preserve"> PAGEREF _Toc307271030 \h </w:instrText>
+          <w:instrText xml:space="preserve"> PAGEREF _Toc243574445 \h </w:instrText>
         </w:r>
         <w:r>
           <w:rPr>
@@ -2134,7 +2614,7 @@
             <w:noProof/>
             <w:webHidden/>
           </w:rPr>
-          <w:t>6</w:t>
+          <w:t>15</w:t>
         </w:r>
         <w:r>
           <w:rPr>
@@ -2153,11 +2633,14 @@
           <w:tab w:val="right" w:pos="9350"/>
         </w:tabs>
         <w:rPr>
+          <w:rFonts w:asciiTheme="minorHAnsi" w:eastAsiaTheme="minorEastAsia" w:hAnsiTheme="minorHAnsi" w:cstheme="minorBidi"/>
           <w:noProof/>
+          <w:kern w:val="2"/>
           <w:sz w:val="24"/>
-        </w:rPr>
-      </w:pPr>
-      <w:hyperlink w:anchor="_Toc307271031" w:history="1">
+          <w14:ligatures w14:val="standardContextual"/>
+        </w:rPr>
+      </w:pPr>
+      <w:hyperlink w:anchor="_Toc243574446" w:history="1">
         <w:r>
           <w:rPr>
             <w:rStyle w:val="Hyperlink"/>
@@ -2167,8 +2650,11 @@
         </w:r>
         <w:r>
           <w:rPr>
-            <w:noProof/>
+            <w:rFonts w:asciiTheme="minorHAnsi" w:eastAsiaTheme="minorEastAsia" w:hAnsiTheme="minorHAnsi" w:cstheme="minorBidi"/>
+            <w:noProof/>
+            <w:kern w:val="2"/>
             <w:sz w:val="24"/>
+            <w14:ligatures w14:val="standardContextual"/>
           </w:rPr>
           <w:tab/>
         </w:r>
@@ -2198,7 +2684,7 @@
             <w:noProof/>
             <w:webHidden/>
           </w:rPr>
-          <w:instrText xml:space="preserve"> PAGEREF _Toc307271031 \h </w:instrText>
+          <w:instrText xml:space="preserve"> PAGEREF _Toc243574446 \h </w:instrText>
         </w:r>
         <w:r>
           <w:rPr>
@@ -2218,7 +2704,7 @@
             <w:noProof/>
             <w:webHidden/>
           </w:rPr>
-          <w:t>6</w:t>
+          <w:t>15</w:t>
         </w:r>
         <w:r>
           <w:rPr>
@@ -2237,11 +2723,14 @@
           <w:tab w:val="right" w:pos="9350"/>
         </w:tabs>
         <w:rPr>
+          <w:rFonts w:asciiTheme="minorHAnsi" w:eastAsiaTheme="minorEastAsia" w:hAnsiTheme="minorHAnsi" w:cstheme="minorBidi"/>
           <w:noProof/>
+          <w:kern w:val="2"/>
           <w:sz w:val="24"/>
-        </w:rPr>
-      </w:pPr>
-      <w:hyperlink w:anchor="_Toc307271032" w:history="1">
+          <w14:ligatures w14:val="standardContextual"/>
+        </w:rPr>
+      </w:pPr>
+      <w:hyperlink w:anchor="_Toc243574447" w:history="1">
         <w:r>
           <w:rPr>
             <w:rStyle w:val="Hyperlink"/>
@@ -2251,8 +2740,11 @@
         </w:r>
         <w:r>
           <w:rPr>
-            <w:noProof/>
+            <w:rFonts w:asciiTheme="minorHAnsi" w:eastAsiaTheme="minorEastAsia" w:hAnsiTheme="minorHAnsi" w:cstheme="minorBidi"/>
+            <w:noProof/>
+            <w:kern w:val="2"/>
             <w:sz w:val="24"/>
+            <w14:ligatures w14:val="standardContextual"/>
           </w:rPr>
           <w:tab/>
         </w:r>
@@ -2282,7 +2774,7 @@
             <w:noProof/>
             <w:webHidden/>
           </w:rPr>
-          <w:instrText xml:space="preserve"> PAGEREF _Toc307271032 \h </w:instrText>
+          <w:instrText xml:space="preserve"> PAGEREF _Toc243574447 \h </w:instrText>
         </w:r>
         <w:r>
           <w:rPr>
@@ -2302,7 +2794,7 @@
             <w:noProof/>
             <w:webHidden/>
           </w:rPr>
-          <w:t>7</w:t>
+          <w:t>15</w:t>
         </w:r>
         <w:r>
           <w:rPr>
@@ -2321,11 +2813,14 @@
           <w:tab w:val="right" w:pos="9350"/>
         </w:tabs>
         <w:rPr>
+          <w:rFonts w:asciiTheme="minorHAnsi" w:eastAsiaTheme="minorEastAsia" w:hAnsiTheme="minorHAnsi" w:cstheme="minorBidi"/>
           <w:noProof/>
+          <w:kern w:val="2"/>
           <w:sz w:val="24"/>
-        </w:rPr>
-      </w:pPr>
-      <w:hyperlink w:anchor="_Toc307271033" w:history="1">
+          <w14:ligatures w14:val="standardContextual"/>
+        </w:rPr>
+      </w:pPr>
+      <w:hyperlink w:anchor="_Toc243574448" w:history="1">
         <w:r>
           <w:rPr>
             <w:rStyle w:val="Hyperlink"/>
@@ -2335,8 +2830,11 @@
         </w:r>
         <w:r>
           <w:rPr>
-            <w:noProof/>
+            <w:rFonts w:asciiTheme="minorHAnsi" w:eastAsiaTheme="minorEastAsia" w:hAnsiTheme="minorHAnsi" w:cstheme="minorBidi"/>
+            <w:noProof/>
+            <w:kern w:val="2"/>
             <w:sz w:val="24"/>
+            <w14:ligatures w14:val="standardContextual"/>
           </w:rPr>
           <w:tab/>
         </w:r>
@@ -2366,7 +2864,7 @@
             <w:noProof/>
             <w:webHidden/>
           </w:rPr>
-          <w:instrText xml:space="preserve"> PAGEREF _Toc307271033 \h </w:instrText>
+          <w:instrText xml:space="preserve"> PAGEREF _Toc243574448 \h </w:instrText>
         </w:r>
         <w:r>
           <w:rPr>
@@ -2386,7 +2884,7 @@
             <w:noProof/>
             <w:webHidden/>
           </w:rPr>
-          <w:t>7</w:t>
+          <w:t>16</w:t>
         </w:r>
         <w:r>
           <w:rPr>
@@ -2405,11 +2903,14 @@
           <w:tab w:val="right" w:pos="9350"/>
         </w:tabs>
         <w:rPr>
+          <w:rFonts w:asciiTheme="minorHAnsi" w:eastAsiaTheme="minorEastAsia" w:hAnsiTheme="minorHAnsi" w:cstheme="minorBidi"/>
           <w:noProof/>
+          <w:kern w:val="2"/>
           <w:sz w:val="24"/>
-        </w:rPr>
-      </w:pPr>
-      <w:hyperlink w:anchor="_Toc307271034" w:history="1">
+          <w14:ligatures w14:val="standardContextual"/>
+        </w:rPr>
+      </w:pPr>
+      <w:hyperlink w:anchor="_Toc243574449" w:history="1">
         <w:r>
           <w:rPr>
             <w:rStyle w:val="Hyperlink"/>
@@ -2419,8 +2920,11 @@
         </w:r>
         <w:r>
           <w:rPr>
-            <w:noProof/>
+            <w:rFonts w:asciiTheme="minorHAnsi" w:eastAsiaTheme="minorEastAsia" w:hAnsiTheme="minorHAnsi" w:cstheme="minorBidi"/>
+            <w:noProof/>
+            <w:kern w:val="2"/>
             <w:sz w:val="24"/>
+            <w14:ligatures w14:val="standardContextual"/>
           </w:rPr>
           <w:tab/>
         </w:r>
@@ -2450,7 +2954,7 @@
             <w:noProof/>
             <w:webHidden/>
           </w:rPr>
-          <w:instrText xml:space="preserve"> PAGEREF _Toc307271034 \h </w:instrText>
+          <w:instrText xml:space="preserve"> PAGEREF _Toc243574449 \h </w:instrText>
         </w:r>
         <w:r>
           <w:rPr>
@@ -2470,7 +2974,7 @@
             <w:noProof/>
             <w:webHidden/>
           </w:rPr>
-          <w:t>7</w:t>
+          <w:t>17</w:t>
         </w:r>
         <w:r>
           <w:rPr>
@@ -2519,14 +3023,14 @@
         <w:pStyle w:val="Heading1"/>
       </w:pPr>
       <w:bookmarkStart w:id="1" w:name="_Toc524312826"/>
-      <w:bookmarkStart w:id="2" w:name="_Toc307271011"/>
-      <w:bookmarkStart w:id="3" w:name="_Toc456598586"/>
-      <w:bookmarkStart w:id="4" w:name="_Toc456600917"/>
+      <w:bookmarkStart w:id="2" w:name="_Toc456598586"/>
+      <w:bookmarkStart w:id="3" w:name="_Toc456600917"/>
+      <w:bookmarkStart w:id="4" w:name="_Toc243574422"/>
       <w:r>
         <w:t>Introduction</w:t>
       </w:r>
       <w:bookmarkEnd w:id="1"/>
-      <w:bookmarkEnd w:id="2"/>
+      <w:bookmarkEnd w:id="4"/>
     </w:p>
     <w:p>
       <w:pPr>
@@ -2561,7 +3065,7 @@
         <w:pStyle w:val="Heading2"/>
       </w:pPr>
       <w:bookmarkStart w:id="5" w:name="_Toc524312827"/>
-      <w:bookmarkStart w:id="6" w:name="_Toc307271012"/>
+      <w:bookmarkStart w:id="6" w:name="_Toc243574423"/>
       <w:r>
         <w:t>Purpose</w:t>
       </w:r>
@@ -2722,7 +3226,7 @@
         <w:pStyle w:val="Heading2"/>
       </w:pPr>
       <w:bookmarkStart w:id="7" w:name="_Toc524312828"/>
-      <w:bookmarkStart w:id="8" w:name="_Toc307271013"/>
+      <w:bookmarkStart w:id="8" w:name="_Toc243574424"/>
       <w:r>
         <w:t>Scope</w:t>
       </w:r>
@@ -2799,7 +3303,7 @@
         <w:pStyle w:val="Heading2"/>
       </w:pPr>
       <w:bookmarkStart w:id="9" w:name="_Toc524312831"/>
-      <w:bookmarkStart w:id="10" w:name="_Toc307271014"/>
+      <w:bookmarkStart w:id="10" w:name="_Toc243574425"/>
       <w:r>
         <w:t>Overview</w:t>
       </w:r>
@@ -2952,7 +3456,7 @@
         <w:pStyle w:val="Heading1"/>
       </w:pPr>
       <w:bookmarkStart w:id="11" w:name="_Toc524312832"/>
-      <w:bookmarkStart w:id="12" w:name="_Toc307271015"/>
+      <w:bookmarkStart w:id="12" w:name="_Toc243574426"/>
       <w:r>
         <w:t>Project Overview</w:t>
       </w:r>
@@ -2964,7 +3468,7 @@
         <w:pStyle w:val="Heading2"/>
       </w:pPr>
       <w:bookmarkStart w:id="13" w:name="_Toc524312833"/>
-      <w:bookmarkStart w:id="14" w:name="_Toc307271016"/>
+      <w:bookmarkStart w:id="14" w:name="_Toc243574427"/>
       <w:r>
         <w:t>Project Purpose, Scope, and Objectives</w:t>
       </w:r>
@@ -3088,7 +3592,7 @@
         <w:pStyle w:val="Heading2"/>
       </w:pPr>
       <w:bookmarkStart w:id="15" w:name="_Toc524312834"/>
-      <w:bookmarkStart w:id="16" w:name="_Toc307271017"/>
+      <w:bookmarkStart w:id="16" w:name="_Toc243574428"/>
       <w:r>
         <w:t>Assumptions and Constraints</w:t>
       </w:r>
@@ -3343,7 +3847,7 @@
         <w:pStyle w:val="Heading2"/>
       </w:pPr>
       <w:bookmarkStart w:id="17" w:name="_Toc524312835"/>
-      <w:bookmarkStart w:id="18" w:name="_Toc307271018"/>
+      <w:bookmarkStart w:id="18" w:name="_Toc243574429"/>
       <w:r>
         <w:t>Project Deliverables</w:t>
       </w:r>
@@ -4081,7 +4585,7 @@
         <w:pStyle w:val="Heading1"/>
       </w:pPr>
       <w:bookmarkStart w:id="19" w:name="_Toc524312837"/>
-      <w:bookmarkStart w:id="20" w:name="_Toc307271019"/>
+      <w:bookmarkStart w:id="20" w:name="_Toc243574430"/>
       <w:r>
         <w:t>Project Organization</w:t>
       </w:r>
@@ -4093,7 +4597,7 @@
         <w:pStyle w:val="Heading2"/>
       </w:pPr>
       <w:bookmarkStart w:id="21" w:name="_Toc524312838"/>
-      <w:bookmarkStart w:id="22" w:name="_Toc307271020"/>
+      <w:bookmarkStart w:id="22" w:name="_Toc243574431"/>
       <w:r>
         <w:t>Organizational Structure</w:t>
       </w:r>
@@ -4349,7 +4853,7 @@
         <w:pStyle w:val="Heading2"/>
       </w:pPr>
       <w:bookmarkStart w:id="23" w:name="_Toc524312840"/>
-      <w:bookmarkStart w:id="24" w:name="_Toc307271021"/>
+      <w:bookmarkStart w:id="24" w:name="_Toc243574432"/>
       <w:r>
         <w:t>Roles and Responsibilities</w:t>
       </w:r>
@@ -4722,7 +5226,7 @@
         <w:pStyle w:val="Heading1"/>
       </w:pPr>
       <w:bookmarkStart w:id="25" w:name="_Toc524312841"/>
-      <w:bookmarkStart w:id="26" w:name="_Toc307271022"/>
+      <w:bookmarkStart w:id="26" w:name="_Toc243574433"/>
       <w:r>
         <w:lastRenderedPageBreak/>
         <w:t>Management Process</w:t>
@@ -4735,7 +5239,7 @@
         <w:pStyle w:val="Heading2"/>
       </w:pPr>
       <w:bookmarkStart w:id="27" w:name="_Toc524312842"/>
-      <w:bookmarkStart w:id="28" w:name="_Toc307271023"/>
+      <w:bookmarkStart w:id="28" w:name="_Toc243574434"/>
       <w:r>
         <w:t>Project Estimates</w:t>
       </w:r>
@@ -4746,9 +5250,11 @@
       <w:pPr>
         <w:pStyle w:val="Heading3"/>
       </w:pPr>
+      <w:bookmarkStart w:id="29" w:name="_Toc243574435"/>
       <w:r>
         <w:t>Cost Estimate</w:t>
       </w:r>
+      <w:bookmarkEnd w:id="29"/>
     </w:p>
     <w:p>
       <w:pPr>
@@ -4770,9 +5276,11 @@
       <w:pPr>
         <w:pStyle w:val="Heading3"/>
       </w:pPr>
+      <w:bookmarkStart w:id="30" w:name="_Toc243574436"/>
       <w:r>
         <w:t>Schedule Estimate</w:t>
       </w:r>
+      <w:bookmarkEnd w:id="30"/>
     </w:p>
     <w:p>
       <w:pPr>
@@ -4897,9 +5405,11 @@
       <w:pPr>
         <w:pStyle w:val="Heading3"/>
       </w:pPr>
+      <w:bookmarkStart w:id="31" w:name="_Toc243574437"/>
       <w:r>
         <w:t>Basis of Estimates</w:t>
       </w:r>
+      <w:bookmarkEnd w:id="31"/>
     </w:p>
     <w:p>
       <w:pPr>
@@ -4981,9 +5491,11 @@
       <w:pPr>
         <w:pStyle w:val="Heading3"/>
       </w:pPr>
+      <w:bookmarkStart w:id="32" w:name="_Toc243574438"/>
       <w:r>
         <w:t>Re-estimation Conditions</w:t>
       </w:r>
+      <w:bookmarkEnd w:id="32"/>
     </w:p>
     <w:p>
       <w:pPr>
@@ -5078,13 +5590,13 @@
       <w:pPr>
         <w:pStyle w:val="Heading2"/>
       </w:pPr>
-      <w:bookmarkStart w:id="29" w:name="_Toc524312843"/>
-      <w:bookmarkStart w:id="30" w:name="_Toc307271024"/>
+      <w:bookmarkStart w:id="33" w:name="_Toc524312843"/>
+      <w:bookmarkStart w:id="34" w:name="_Toc243574439"/>
       <w:r>
         <w:t>Project Plan</w:t>
       </w:r>
-      <w:bookmarkEnd w:id="29"/>
-      <w:bookmarkEnd w:id="30"/>
+      <w:bookmarkEnd w:id="33"/>
+      <w:bookmarkEnd w:id="34"/>
     </w:p>
     <w:p>
       <w:pPr>
@@ -5126,13 +5638,13 @@
       <w:pPr>
         <w:pStyle w:val="Heading3"/>
       </w:pPr>
-      <w:bookmarkStart w:id="31" w:name="_Toc524312844"/>
-      <w:bookmarkStart w:id="32" w:name="_Toc307271025"/>
+      <w:bookmarkStart w:id="35" w:name="_Toc524312844"/>
+      <w:bookmarkStart w:id="36" w:name="_Toc243574440"/>
       <w:r>
         <w:t>Phase Plan</w:t>
       </w:r>
-      <w:bookmarkEnd w:id="31"/>
-      <w:bookmarkEnd w:id="32"/>
+      <w:bookmarkEnd w:id="35"/>
+      <w:bookmarkEnd w:id="36"/>
     </w:p>
     <w:p>
       <w:pPr>
@@ -5320,13 +5832,13 @@
       <w:pPr>
         <w:pStyle w:val="Heading3"/>
       </w:pPr>
-      <w:bookmarkStart w:id="33" w:name="_Toc524312845"/>
-      <w:bookmarkStart w:id="34" w:name="_Toc307271026"/>
+      <w:bookmarkStart w:id="37" w:name="_Toc524312845"/>
+      <w:bookmarkStart w:id="38" w:name="_Toc243574441"/>
       <w:r>
         <w:t>Iteration Objectives</w:t>
       </w:r>
-      <w:bookmarkEnd w:id="33"/>
-      <w:bookmarkEnd w:id="34"/>
+      <w:bookmarkEnd w:id="37"/>
+      <w:bookmarkEnd w:id="38"/>
     </w:p>
     <w:p>
       <w:pPr>
@@ -5878,13 +6390,13 @@
       <w:pPr>
         <w:pStyle w:val="Heading3"/>
       </w:pPr>
-      <w:bookmarkStart w:id="35" w:name="_Toc524312846"/>
-      <w:bookmarkStart w:id="36" w:name="_Toc307271027"/>
+      <w:bookmarkStart w:id="39" w:name="_Toc524312846"/>
+      <w:bookmarkStart w:id="40" w:name="_Toc243574442"/>
       <w:r>
         <w:t>Releases</w:t>
       </w:r>
-      <w:bookmarkEnd w:id="35"/>
-      <w:bookmarkEnd w:id="36"/>
+      <w:bookmarkEnd w:id="39"/>
+      <w:bookmarkEnd w:id="40"/>
     </w:p>
     <w:p>
       <w:pPr>
@@ -6725,13 +7237,13 @@
       <w:pPr>
         <w:pStyle w:val="Heading3"/>
       </w:pPr>
-      <w:bookmarkStart w:id="37" w:name="_Toc524312847"/>
-      <w:bookmarkStart w:id="38" w:name="_Toc307271028"/>
+      <w:bookmarkStart w:id="41" w:name="_Toc524312847"/>
+      <w:bookmarkStart w:id="42" w:name="_Toc243574443"/>
       <w:r>
         <w:t>Project Schedule</w:t>
       </w:r>
-      <w:bookmarkEnd w:id="37"/>
-      <w:bookmarkEnd w:id="38"/>
+      <w:bookmarkEnd w:id="41"/>
+      <w:bookmarkEnd w:id="42"/>
     </w:p>
     <w:p>
       <w:pPr>
@@ -7452,13 +7964,13 @@
       <w:pPr>
         <w:pStyle w:val="Heading3"/>
       </w:pPr>
-      <w:bookmarkStart w:id="39" w:name="_Toc524312848"/>
-      <w:bookmarkStart w:id="40" w:name="_Toc307271029"/>
+      <w:bookmarkStart w:id="43" w:name="_Toc524312848"/>
+      <w:bookmarkStart w:id="44" w:name="_Toc243574444"/>
       <w:r>
         <w:t>Project Resourcing</w:t>
       </w:r>
-      <w:bookmarkEnd w:id="39"/>
-      <w:bookmarkEnd w:id="40"/>
+      <w:bookmarkEnd w:id="43"/>
+      <w:bookmarkEnd w:id="44"/>
     </w:p>
     <w:p>
       <w:pPr>
@@ -7984,36 +8496,31 @@
           <w:color w:val="auto"/>
         </w:rPr>
       </w:pPr>
-      <w:bookmarkStart w:id="41" w:name="_Toc447095892"/>
-      <w:bookmarkStart w:id="42" w:name="_Toc512930361"/>
-      <w:bookmarkStart w:id="43" w:name="_Toc447095893"/>
-      <w:bookmarkStart w:id="44" w:name="_Toc512930362"/>
-      <w:bookmarkStart w:id="45" w:name="_Toc430447687"/>
-      <w:bookmarkStart w:id="46" w:name="_Toc447095894"/>
-      <w:bookmarkStart w:id="47" w:name="_Toc512930363"/>
-      <w:bookmarkStart w:id="48" w:name="_Toc430447688"/>
-      <w:bookmarkStart w:id="49" w:name="_Toc430447689"/>
-      <w:bookmarkStart w:id="50" w:name="_Toc447095895"/>
-      <w:bookmarkStart w:id="51" w:name="_Toc512930364"/>
-      <w:bookmarkStart w:id="52" w:name="_Toc430447690"/>
-      <w:bookmarkStart w:id="53" w:name="_Toc447095896"/>
-      <w:bookmarkStart w:id="54" w:name="_Toc512930365"/>
-      <w:bookmarkStart w:id="55" w:name="_Toc447095897"/>
-      <w:bookmarkStart w:id="56" w:name="_Toc512930366"/>
-      <w:bookmarkStart w:id="57" w:name="_Toc430447691"/>
-      <w:bookmarkStart w:id="58" w:name="_Toc447095898"/>
-      <w:bookmarkStart w:id="59" w:name="_Toc512930367"/>
-      <w:bookmarkStart w:id="60" w:name="_Toc447095908"/>
-      <w:bookmarkStart w:id="61" w:name="_Toc512930368"/>
-      <w:bookmarkStart w:id="62" w:name="_Toc513004379"/>
-      <w:bookmarkStart w:id="63" w:name="_Toc307271030"/>
+      <w:bookmarkStart w:id="45" w:name="_Toc447095892"/>
+      <w:bookmarkStart w:id="46" w:name="_Toc512930361"/>
+      <w:bookmarkStart w:id="47" w:name="_Toc447095893"/>
+      <w:bookmarkStart w:id="48" w:name="_Toc512930362"/>
+      <w:bookmarkStart w:id="49" w:name="_Toc430447687"/>
+      <w:bookmarkStart w:id="50" w:name="_Toc447095894"/>
+      <w:bookmarkStart w:id="51" w:name="_Toc512930363"/>
+      <w:bookmarkStart w:id="52" w:name="_Toc430447688"/>
+      <w:bookmarkStart w:id="53" w:name="_Toc430447689"/>
+      <w:bookmarkStart w:id="54" w:name="_Toc447095895"/>
+      <w:bookmarkStart w:id="55" w:name="_Toc512930364"/>
+      <w:bookmarkStart w:id="56" w:name="_Toc430447690"/>
+      <w:bookmarkStart w:id="57" w:name="_Toc447095896"/>
+      <w:bookmarkStart w:id="58" w:name="_Toc512930365"/>
+      <w:bookmarkStart w:id="59" w:name="_Toc447095897"/>
+      <w:bookmarkStart w:id="60" w:name="_Toc512930366"/>
+      <w:bookmarkStart w:id="61" w:name="_Toc430447691"/>
+      <w:bookmarkStart w:id="62" w:name="_Toc447095898"/>
+      <w:bookmarkStart w:id="63" w:name="_Toc512930367"/>
+      <w:bookmarkStart w:id="64" w:name="_Toc447095908"/>
+      <w:bookmarkStart w:id="65" w:name="_Toc512930368"/>
+      <w:bookmarkStart w:id="66" w:name="_Toc513004379"/>
       <w:bookmarkEnd w:id="0"/>
+      <w:bookmarkEnd w:id="2"/>
       <w:bookmarkEnd w:id="3"/>
-      <w:bookmarkEnd w:id="4"/>
-      <w:bookmarkEnd w:id="41"/>
-      <w:bookmarkEnd w:id="42"/>
-      <w:bookmarkEnd w:id="43"/>
-      <w:bookmarkEnd w:id="44"/>
       <w:bookmarkEnd w:id="45"/>
       <w:bookmarkEnd w:id="46"/>
       <w:bookmarkEnd w:id="47"/>
@@ -8031,6 +8538,10 @@
       <w:bookmarkEnd w:id="59"/>
       <w:bookmarkEnd w:id="60"/>
       <w:bookmarkEnd w:id="61"/>
+      <w:bookmarkEnd w:id="62"/>
+      <w:bookmarkEnd w:id="63"/>
+      <w:bookmarkEnd w:id="64"/>
+      <w:bookmarkEnd w:id="65"/>
       <w:r>
         <w:rPr>
           <w:i w:val="0"/>
@@ -8271,11 +8782,12 @@
       <w:pPr>
         <w:pStyle w:val="Heading2"/>
       </w:pPr>
+      <w:bookmarkStart w:id="67" w:name="_Toc243574445"/>
       <w:r>
         <w:t>Project Monitoring and Control</w:t>
       </w:r>
-      <w:bookmarkEnd w:id="62"/>
-      <w:bookmarkEnd w:id="63"/>
+      <w:bookmarkEnd w:id="66"/>
+      <w:bookmarkEnd w:id="67"/>
     </w:p>
     <w:p>
       <w:pPr>
@@ -8286,7 +8798,7 @@
           <w:color w:val="auto"/>
         </w:rPr>
       </w:pPr>
-      <w:bookmarkStart w:id="64" w:name="_Toc447095909"/>
+      <w:bookmarkStart w:id="68" w:name="_Toc447095909"/>
       <w:r>
         <w:rPr>
           <w:i w:val="0"/>
@@ -8334,18 +8846,18 @@
       <w:pPr>
         <w:pStyle w:val="Heading3"/>
       </w:pPr>
-      <w:bookmarkStart w:id="65" w:name="_Toc307271031"/>
+      <w:bookmarkStart w:id="69" w:name="_Toc243574446"/>
       <w:r>
         <w:t>Requirements Management</w:t>
       </w:r>
-      <w:bookmarkEnd w:id="64"/>
-      <w:bookmarkEnd w:id="65"/>
+      <w:bookmarkEnd w:id="68"/>
+      <w:bookmarkEnd w:id="69"/>
     </w:p>
     <w:p>
       <w:pPr>
         <w:pStyle w:val="BodyText"/>
       </w:pPr>
-      <w:bookmarkStart w:id="66" w:name="_Toc447095911"/>
+      <w:bookmarkStart w:id="70" w:name="_Toc447095911"/>
       <w:r>
         <w:t xml:space="preserve">The requirements for the </w:t>
       </w:r>
@@ -8387,28 +8899,28 @@
       <w:pPr>
         <w:pStyle w:val="Heading3"/>
       </w:pPr>
-      <w:bookmarkStart w:id="67" w:name="_Toc447095913"/>
-      <w:bookmarkStart w:id="68" w:name="_Toc307271032"/>
-      <w:bookmarkEnd w:id="66"/>
+      <w:bookmarkStart w:id="71" w:name="_Toc447095913"/>
+      <w:bookmarkStart w:id="72" w:name="_Toc243574447"/>
+      <w:bookmarkEnd w:id="70"/>
       <w:r>
         <w:t xml:space="preserve">Reporting </w:t>
       </w:r>
-      <w:bookmarkEnd w:id="67"/>
+      <w:bookmarkEnd w:id="71"/>
       <w:r>
         <w:t>and Measurement</w:t>
       </w:r>
-      <w:bookmarkEnd w:id="68"/>
+      <w:bookmarkEnd w:id="72"/>
     </w:p>
     <w:p>
       <w:pPr>
         <w:pStyle w:val="BodyText"/>
       </w:pPr>
-      <w:bookmarkStart w:id="69" w:name="_Toc447095914"/>
+      <w:bookmarkStart w:id="73" w:name="_Toc447095914"/>
       <w:r>
         <w:t>Updated cost and schedule estimates, and metrics summary reports, will be generated at the end of each iteration.</w:t>
       </w:r>
     </w:p>
-    <w:bookmarkEnd w:id="69"/>
+    <w:bookmarkEnd w:id="73"/>
     <w:p>
       <w:pPr>
         <w:pStyle w:val="BodyText"/>
@@ -8465,22 +8977,22 @@
       <w:pPr>
         <w:pStyle w:val="Heading3"/>
       </w:pPr>
-      <w:bookmarkStart w:id="70" w:name="_Toc307271033"/>
-      <w:bookmarkStart w:id="71" w:name="_Toc447095915"/>
+      <w:bookmarkStart w:id="74" w:name="_Toc447095915"/>
+      <w:bookmarkStart w:id="75" w:name="_Toc243574448"/>
       <w:r>
         <w:t>Risk Management</w:t>
       </w:r>
-      <w:bookmarkEnd w:id="70"/>
+      <w:bookmarkEnd w:id="75"/>
       <w:r>
         <w:t xml:space="preserve"> </w:t>
       </w:r>
-      <w:bookmarkEnd w:id="71"/>
+      <w:bookmarkEnd w:id="74"/>
     </w:p>
     <w:p>
       <w:pPr>
         <w:pStyle w:val="BodyText"/>
       </w:pPr>
-      <w:bookmarkStart w:id="72" w:name="_Toc447095916"/>
+      <w:bookmarkStart w:id="76" w:name="_Toc447095916"/>
       <w:r>
         <w:t>Risks will be identified in Inception Phase using the steps identified in the RUP for Small Projects activity “Identify and Assess Risks”. Project risk is evaluated at least once per iteration and documented in this table. The risks of the greatest magnitude are listed first in the table.</w:t>
       </w:r>
@@ -9354,11 +9866,11 @@
       <w:pPr>
         <w:pStyle w:val="Heading3"/>
       </w:pPr>
-      <w:bookmarkStart w:id="73" w:name="_Toc307271034"/>
+      <w:bookmarkStart w:id="77" w:name="_Toc243574449"/>
       <w:r>
         <w:t>Configuration Management</w:t>
       </w:r>
-      <w:bookmarkEnd w:id="73"/>
+      <w:bookmarkEnd w:id="77"/>
     </w:p>
     <w:p>
       <w:pPr>
@@ -9389,15 +9901,15 @@
       <w:pPr>
         <w:pStyle w:val="BodyText"/>
       </w:pPr>
-      <w:bookmarkStart w:id="74" w:name="_Toc447095917"/>
-      <w:bookmarkStart w:id="75" w:name="_Toc512930369"/>
-      <w:bookmarkStart w:id="76" w:name="_Toc447095932"/>
-      <w:bookmarkStart w:id="77" w:name="_Toc512930370"/>
-      <w:bookmarkEnd w:id="72"/>
-      <w:bookmarkEnd w:id="74"/>
-      <w:bookmarkEnd w:id="75"/>
+      <w:bookmarkStart w:id="78" w:name="_Toc447095917"/>
+      <w:bookmarkStart w:id="79" w:name="_Toc512930369"/>
+      <w:bookmarkStart w:id="80" w:name="_Toc447095932"/>
+      <w:bookmarkStart w:id="81" w:name="_Toc512930370"/>
       <w:bookmarkEnd w:id="76"/>
-      <w:bookmarkEnd w:id="77"/>
+      <w:bookmarkEnd w:id="78"/>
+      <w:bookmarkEnd w:id="79"/>
+      <w:bookmarkEnd w:id="80"/>
+      <w:bookmarkEnd w:id="81"/>
     </w:p>
     <w:sectPr>
       <w:headerReference w:type="default" r:id="rId12"/>
@@ -11598,9 +12110,13 @@
     <w:lsdException w:name="heading 7" w:qFormat="1"/>
     <w:lsdException w:name="heading 8" w:qFormat="1"/>
     <w:lsdException w:name="heading 9" w:qFormat="1"/>
+    <w:lsdException w:name="toc 1" w:uiPriority="39"/>
+    <w:lsdException w:name="toc 2" w:uiPriority="39"/>
+    <w:lsdException w:name="toc 3" w:uiPriority="39"/>
     <w:lsdException w:name="caption" w:semiHidden="1" w:unhideWhenUsed="1" w:qFormat="1"/>
     <w:lsdException w:name="Title" w:qFormat="1"/>
     <w:lsdException w:name="Subtitle" w:qFormat="1"/>
+    <w:lsdException w:name="Hyperlink" w:uiPriority="99"/>
     <w:lsdException w:name="Strong" w:uiPriority="22" w:qFormat="1"/>
     <w:lsdException w:name="Emphasis" w:qFormat="1"/>
     <w:lsdException w:name="Normal (Web)" w:uiPriority="99"/>
@@ -12118,7 +12634,7 @@
     <w:name w:val="toc 1"/>
     <w:basedOn w:val="Normal"/>
     <w:next w:val="Normal"/>
-    <w:semiHidden/>
+    <w:uiPriority w:val="39"/>
     <w:pPr>
       <w:spacing w:before="240" w:after="120"/>
     </w:pPr>
@@ -12132,7 +12648,7 @@
     <w:name w:val="toc 2"/>
     <w:basedOn w:val="Normal"/>
     <w:next w:val="Normal"/>
-    <w:semiHidden/>
+    <w:uiPriority w:val="39"/>
     <w:pPr>
       <w:spacing w:before="120"/>
       <w:ind w:left="200"/>
@@ -12147,7 +12663,7 @@
     <w:name w:val="toc 3"/>
     <w:basedOn w:val="Normal"/>
     <w:next w:val="Normal"/>
-    <w:semiHidden/>
+    <w:uiPriority w:val="39"/>
     <w:pPr>
       <w:ind w:left="400"/>
     </w:pPr>
@@ -12452,6 +12968,7 @@
   <w:style w:type="character" w:styleId="Hyperlink">
     <w:name w:val="Hyperlink"/>
     <w:basedOn w:val="DefaultParagraphFont"/>
+    <w:uiPriority w:val="99"/>
     <w:rPr>
       <w:color w:val="0000FF"/>
       <w:u w:val="single"/>

</xml_diff>